<commit_message>
Add dev-filings-only corpus runs to Excel log and Task #5 doc
Co-Authored-By: Claude Opus 5.5 <noreply@anthropic.com>
</commit_message>
<xml_diff>
--- a/task5-chunking-findings.docx
+++ b/task5-chunking-findings.docx
@@ -2695,6 +2695,1188 @@
           <w:szCs w:val="22"/>
         </w:rPr>
         <w:t>The conclusion remains the same: although the evidence exists in the chunks for 100% of questions, the retriever finds it only 21% of the time, making retrieval—not chunking—the main problem. Page-level chunking is still recommended for simpler citations, while 600-word chunks perform slightly better under the stricter text rule (0.250). However, the corpus includes four extra test filings, which make retrieval harder, and the small sample of 48 questions means the results are not conclusive. These findings come from rows 19–24 of results/task9-experiment-log.csv, the first rows using the development split.</w:t>
+      </w:r>
+    </w:p>
+    <w:p>
+      <w:pPr>
+        <w:pBdr>
+          <w:bottom w:val="single" w:sz="6" w:space="6" w:color="BFBFBF"/>
+        </w:pBdr>
+        <w:spacing w:before="400" w:after="200"/>
+      </w:pPr>
+    </w:p>
+    <w:p>
+      <w:pPr>
+        <w:spacing w:after="160"/>
+      </w:pPr>
+      <w:r>
+        <w:rPr>
+          <w:b/>
+          <w:bCs/>
+          <w:color w:val="1F3864"/>
+          <w:sz w:val="30"/>
+          <w:szCs w:val="30"/>
+        </w:rPr>
+        <w:t>Update: October 31, 2026</w:t>
+      </w:r>
+    </w:p>
+    <w:p>
+      <w:pPr>
+        <w:spacing w:after="140" w:line="276" w:lineRule="auto"/>
+        <w:rPr>
+          <w:sz w:val="22"/>
+          <w:szCs w:val="22"/>
+        </w:rPr>
+      </w:pPr>
+      <w:r>
+        <w:rPr>
+          <w:sz w:val="22"/>
+          <w:szCs w:val="22"/>
+        </w:rPr>
+        <w:t xml:space="preserve">The corpus still held the 4 downloaded test filings. Their questions were never scored, but their pages could still be searched. The chunker now keeps development filings only, so the corpus is 12 filings and 1,610 page chunks, and every run was repeated. The table shows the runs with the metadata filter on, now with BM25 as well as TF-IDF. The filter-off runs are in results/task9-experiment-log.csv, runs 31 to 42.</w:t>
+      </w:r>
+      <w:proofErr w:type="gramStart"/>
+      <w:proofErr w:type="gramEnd"/>
+    </w:p>
+    <w:tbl>
+      <w:tblPr>
+        <w:tblW w:w="9360" w:type="dxa"/>
+        <w:tblBorders>
+          <w:top w:val="single" w:sz="4" w:space="0" w:color="auto"/>
+          <w:left w:val="single" w:sz="4" w:space="0" w:color="auto"/>
+          <w:bottom w:val="single" w:sz="4" w:space="0" w:color="auto"/>
+          <w:right w:val="single" w:sz="4" w:space="0" w:color="auto"/>
+          <w:insideH w:val="single" w:sz="4" w:space="0" w:color="auto"/>
+          <w:insideV w:val="single" w:sz="4" w:space="0" w:color="auto"/>
+        </w:tblBorders>
+        <w:tblLook w:val="04A0" w:firstRow="1" w:lastRow="0" w:firstColumn="1" w:lastColumn="0" w:noHBand="0" w:noVBand="1"/>
+      </w:tblPr>
+      <w:tblGrid>
+        <w:gridCol w:w="700"/>
+        <w:gridCol w:w="1500"/>
+        <w:gridCol w:w="900"/>
+        <w:gridCol w:w="1000"/>
+        <w:gridCol w:w="1000"/>
+        <w:gridCol w:w="1300"/>
+        <w:gridCol w:w="1100"/>
+        <w:gridCol w:w="1860"/>
+      </w:tblGrid>
+      <w:tr>
+        <w:trPr>
+          <w:tblHeader/>
+        </w:trPr>
+        <w:tc>
+          <w:tcPr>
+            <w:tcW w:w="700" w:type="dxa"/>
+            <w:shd w:val="clear" w:color="auto" w:fill="EFEFEF"/>
+            <w:tcMar>
+              <w:top w:w="60" w:type="dxa"/>
+              <w:left w:w="100" w:type="dxa"/>
+              <w:bottom w:w="60" w:type="dxa"/>
+              <w:right w:w="100" w:type="dxa"/>
+            </w:tcMar>
+          </w:tcPr>
+          <w:p>
+            <w:r>
+              <w:rPr>
+                <w:b/>
+                <w:bCs/>
+              </w:rPr>
+              <w:t>Run</w:t>
+            </w:r>
+          </w:p>
+        </w:tc>
+        <w:tc>
+          <w:tcPr>
+            <w:tcW w:w="1500" w:type="dxa"/>
+            <w:shd w:val="clear" w:color="auto" w:fill="EFEFEF"/>
+            <w:tcMar>
+              <w:top w:w="60" w:type="dxa"/>
+              <w:left w:w="100" w:type="dxa"/>
+              <w:bottom w:w="60" w:type="dxa"/>
+              <w:right w:w="100" w:type="dxa"/>
+            </w:tcMar>
+          </w:tcPr>
+          <w:p>
+            <w:pPr>
+              <w:jc w:val="center"/>
+            </w:pPr>
+            <w:r>
+              <w:rPr>
+                <w:b/>
+                <w:bCs/>
+              </w:rPr>
+              <w:t>Chunking</w:t>
+            </w:r>
+          </w:p>
+        </w:tc>
+        <w:tc>
+          <w:tcPr>
+            <w:tcW w:w="900" w:type="dxa"/>
+            <w:shd w:val="clear" w:color="auto" w:fill="EFEFEF"/>
+            <w:tcMar>
+              <w:top w:w="60" w:type="dxa"/>
+              <w:left w:w="100" w:type="dxa"/>
+              <w:bottom w:w="60" w:type="dxa"/>
+              <w:right w:w="100" w:type="dxa"/>
+            </w:tcMar>
+          </w:tcPr>
+          <w:p>
+            <w:pPr>
+              <w:jc w:val="center"/>
+            </w:pPr>
+            <w:r>
+              <w:rPr>
+                <w:b/>
+                <w:bCs/>
+              </w:rPr>
+              <w:t>Retriever</w:t>
+            </w:r>
+          </w:p>
+        </w:tc>
+        <w:tc>
+          <w:tcPr>
+            <w:tcW w:w="1000" w:type="dxa"/>
+            <w:shd w:val="clear" w:color="auto" w:fill="EFEFEF"/>
+            <w:tcMar>
+              <w:top w:w="60" w:type="dxa"/>
+              <w:left w:w="100" w:type="dxa"/>
+              <w:bottom w:w="60" w:type="dxa"/>
+              <w:right w:w="100" w:type="dxa"/>
+            </w:tcMar>
+          </w:tcPr>
+          <w:p>
+            <w:pPr>
+              <w:jc w:val="center"/>
+            </w:pPr>
+            <w:r>
+              <w:rPr>
+                <w:b/>
+                <w:bCs/>
+              </w:rPr>
+              <w:t>Hit@1</w:t>
+            </w:r>
+          </w:p>
+        </w:tc>
+        <w:tc>
+          <w:tcPr>
+            <w:tcW w:w="1000" w:type="dxa"/>
+            <w:shd w:val="clear" w:color="auto" w:fill="EFEFEF"/>
+            <w:tcMar>
+              <w:top w:w="60" w:type="dxa"/>
+              <w:left w:w="100" w:type="dxa"/>
+              <w:bottom w:w="60" w:type="dxa"/>
+              <w:right w:w="100" w:type="dxa"/>
+            </w:tcMar>
+          </w:tcPr>
+          <w:p>
+            <w:pPr>
+              <w:jc w:val="center"/>
+            </w:pPr>
+            <w:r>
+              <w:rPr>
+                <w:b/>
+                <w:bCs/>
+              </w:rPr>
+              <w:t>Hit@5</w:t>
+            </w:r>
+          </w:p>
+        </w:tc>
+        <w:tc>
+          <w:tcPr>
+            <w:tcW w:w="1300" w:type="dxa"/>
+            <w:shd w:val="clear" w:color="auto" w:fill="EFEFEF"/>
+            <w:tcMar>
+              <w:top w:w="60" w:type="dxa"/>
+              <w:left w:w="100" w:type="dxa"/>
+              <w:bottom w:w="60" w:type="dxa"/>
+              <w:right w:w="100" w:type="dxa"/>
+            </w:tcMar>
+          </w:tcPr>
+          <w:p>
+            <w:pPr>
+              <w:jc w:val="center"/>
+            </w:pPr>
+            <w:r>
+              <w:rPr>
+                <w:b/>
+                <w:bCs/>
+              </w:rPr>
+              <w:t>Text Hit@5</w:t>
+            </w:r>
+          </w:p>
+        </w:tc>
+        <w:tc>
+          <w:tcPr>
+            <w:tcW w:w="1100" w:type="dxa"/>
+            <w:shd w:val="clear" w:color="auto" w:fill="EFEFEF"/>
+            <w:tcMar>
+              <w:top w:w="60" w:type="dxa"/>
+              <w:left w:w="100" w:type="dxa"/>
+              <w:bottom w:w="60" w:type="dxa"/>
+              <w:right w:w="100" w:type="dxa"/>
+            </w:tcMar>
+          </w:tcPr>
+          <w:p>
+            <w:pPr>
+              <w:jc w:val="center"/>
+            </w:pPr>
+            <w:r>
+              <w:rPr>
+                <w:b/>
+                <w:bCs/>
+              </w:rPr>
+              <w:t>MRR@10</w:t>
+            </w:r>
+          </w:p>
+        </w:tc>
+        <w:tc>
+          <w:tcPr>
+            <w:tcW w:w="1860" w:type="dxa"/>
+            <w:shd w:val="clear" w:color="auto" w:fill="EFEFEF"/>
+            <w:tcMar>
+              <w:top w:w="60" w:type="dxa"/>
+              <w:left w:w="100" w:type="dxa"/>
+              <w:bottom w:w="60" w:type="dxa"/>
+              <w:right w:w="100" w:type="dxa"/>
+            </w:tcMar>
+          </w:tcPr>
+          <w:p>
+            <w:pPr>
+              <w:jc w:val="center"/>
+            </w:pPr>
+            <w:r>
+              <w:rPr>
+                <w:b/>
+                <w:bCs/>
+              </w:rPr>
+              <w:t>Evidence kept whole</w:t>
+            </w:r>
+          </w:p>
+        </w:tc>
+      </w:tr>
+      <w:tr>
+        <w:tc>
+          <w:tcPr>
+            <w:tcW w:w="700" w:type="dxa"/>
+            <w:tcMar>
+              <w:top w:w="60" w:type="dxa"/>
+              <w:left w:w="100" w:type="dxa"/>
+              <w:bottom w:w="60" w:type="dxa"/>
+              <w:right w:w="100" w:type="dxa"/>
+            </w:tcMar>
+          </w:tcPr>
+          <w:p>
+            <w:r>
+              <w:t>32</w:t>
+            </w:r>
+          </w:p>
+        </w:tc>
+        <w:tc>
+          <w:tcPr>
+            <w:tcW w:w="1500" w:type="dxa"/>
+            <w:tcMar>
+              <w:top w:w="60" w:type="dxa"/>
+              <w:left w:w="100" w:type="dxa"/>
+              <w:bottom w:w="60" w:type="dxa"/>
+              <w:right w:w="100" w:type="dxa"/>
+            </w:tcMar>
+          </w:tcPr>
+          <w:p>
+            <w:pPr>
+              <w:jc w:val="center"/>
+            </w:pPr>
+            <w:r>
+              <w:t>Page</w:t>
+            </w:r>
+          </w:p>
+        </w:tc>
+        <w:tc>
+          <w:tcPr>
+            <w:tcW w:w="900" w:type="dxa"/>
+            <w:tcMar>
+              <w:top w:w="60" w:type="dxa"/>
+              <w:left w:w="100" w:type="dxa"/>
+              <w:bottom w:w="60" w:type="dxa"/>
+              <w:right w:w="100" w:type="dxa"/>
+            </w:tcMar>
+          </w:tcPr>
+          <w:p>
+            <w:pPr>
+              <w:jc w:val="center"/>
+            </w:pPr>
+            <w:r>
+              <w:t>TF-IDF</w:t>
+            </w:r>
+          </w:p>
+        </w:tc>
+        <w:tc>
+          <w:tcPr>
+            <w:tcW w:w="1000" w:type="dxa"/>
+            <w:tcMar>
+              <w:top w:w="60" w:type="dxa"/>
+              <w:left w:w="100" w:type="dxa"/>
+              <w:bottom w:w="60" w:type="dxa"/>
+              <w:right w:w="100" w:type="dxa"/>
+            </w:tcMar>
+          </w:tcPr>
+          <w:p>
+            <w:pPr>
+              <w:jc w:val="center"/>
+            </w:pPr>
+            <w:r>
+              <w:t>0.021</w:t>
+            </w:r>
+          </w:p>
+        </w:tc>
+        <w:tc>
+          <w:tcPr>
+            <w:tcW w:w="1000" w:type="dxa"/>
+            <w:tcMar>
+              <w:top w:w="60" w:type="dxa"/>
+              <w:left w:w="100" w:type="dxa"/>
+              <w:bottom w:w="60" w:type="dxa"/>
+              <w:right w:w="100" w:type="dxa"/>
+            </w:tcMar>
+          </w:tcPr>
+          <w:p>
+            <w:pPr>
+              <w:jc w:val="center"/>
+            </w:pPr>
+            <w:r>
+              <w:t>0.250</w:t>
+            </w:r>
+          </w:p>
+        </w:tc>
+        <w:tc>
+          <w:tcPr>
+            <w:tcW w:w="1300" w:type="dxa"/>
+            <w:tcMar>
+              <w:top w:w="60" w:type="dxa"/>
+              <w:left w:w="100" w:type="dxa"/>
+              <w:bottom w:w="60" w:type="dxa"/>
+              <w:right w:w="100" w:type="dxa"/>
+            </w:tcMar>
+          </w:tcPr>
+          <w:p>
+            <w:pPr>
+              <w:jc w:val="center"/>
+            </w:pPr>
+            <w:r>
+              <w:t>0.271</w:t>
+            </w:r>
+          </w:p>
+        </w:tc>
+        <w:tc>
+          <w:tcPr>
+            <w:tcW w:w="1100" w:type="dxa"/>
+            <w:tcMar>
+              <w:top w:w="60" w:type="dxa"/>
+              <w:left w:w="100" w:type="dxa"/>
+              <w:bottom w:w="60" w:type="dxa"/>
+              <w:right w:w="100" w:type="dxa"/>
+            </w:tcMar>
+          </w:tcPr>
+          <w:p>
+            <w:pPr>
+              <w:jc w:val="center"/>
+            </w:pPr>
+            <w:r>
+              <w:t>0.128</w:t>
+            </w:r>
+          </w:p>
+        </w:tc>
+        <w:tc>
+          <w:tcPr>
+            <w:tcW w:w="1860" w:type="dxa"/>
+            <w:tcMar>
+              <w:top w:w="60" w:type="dxa"/>
+              <w:left w:w="100" w:type="dxa"/>
+              <w:bottom w:w="60" w:type="dxa"/>
+              <w:right w:w="100" w:type="dxa"/>
+            </w:tcMar>
+          </w:tcPr>
+          <w:p>
+            <w:pPr>
+              <w:jc w:val="center"/>
+            </w:pPr>
+            <w:r>
+              <w:t>100%</w:t>
+            </w:r>
+          </w:p>
+        </w:tc>
+      </w:tr>
+      <w:tr>
+        <w:tc>
+          <w:tcPr>
+            <w:tcW w:w="700" w:type="dxa"/>
+            <w:tcMar>
+              <w:top w:w="60" w:type="dxa"/>
+              <w:left w:w="100" w:type="dxa"/>
+              <w:bottom w:w="60" w:type="dxa"/>
+              <w:right w:w="100" w:type="dxa"/>
+            </w:tcMar>
+          </w:tcPr>
+          <w:p>
+            <w:r>
+              <w:t>34</w:t>
+            </w:r>
+          </w:p>
+        </w:tc>
+        <w:tc>
+          <w:tcPr>
+            <w:tcW w:w="1500" w:type="dxa"/>
+            <w:tcMar>
+              <w:top w:w="60" w:type="dxa"/>
+              <w:left w:w="100" w:type="dxa"/>
+              <w:bottom w:w="60" w:type="dxa"/>
+              <w:right w:w="100" w:type="dxa"/>
+            </w:tcMar>
+          </w:tcPr>
+          <w:p>
+            <w:pPr>
+              <w:jc w:val="center"/>
+            </w:pPr>
+            <w:r>
+              <w:t>300 / 50</w:t>
+            </w:r>
+          </w:p>
+        </w:tc>
+        <w:tc>
+          <w:tcPr>
+            <w:tcW w:w="900" w:type="dxa"/>
+            <w:tcMar>
+              <w:top w:w="60" w:type="dxa"/>
+              <w:left w:w="100" w:type="dxa"/>
+              <w:bottom w:w="60" w:type="dxa"/>
+              <w:right w:w="100" w:type="dxa"/>
+            </w:tcMar>
+          </w:tcPr>
+          <w:p>
+            <w:pPr>
+              <w:jc w:val="center"/>
+            </w:pPr>
+            <w:r>
+              <w:t>TF-IDF</w:t>
+            </w:r>
+          </w:p>
+        </w:tc>
+        <w:tc>
+          <w:tcPr>
+            <w:tcW w:w="1000" w:type="dxa"/>
+            <w:tcMar>
+              <w:top w:w="60" w:type="dxa"/>
+              <w:left w:w="100" w:type="dxa"/>
+              <w:bottom w:w="60" w:type="dxa"/>
+              <w:right w:w="100" w:type="dxa"/>
+            </w:tcMar>
+          </w:tcPr>
+          <w:p>
+            <w:pPr>
+              <w:jc w:val="center"/>
+            </w:pPr>
+            <w:r>
+              <w:t>0.083</w:t>
+            </w:r>
+          </w:p>
+        </w:tc>
+        <w:tc>
+          <w:tcPr>
+            <w:tcW w:w="1000" w:type="dxa"/>
+            <w:tcMar>
+              <w:top w:w="60" w:type="dxa"/>
+              <w:left w:w="100" w:type="dxa"/>
+              <w:bottom w:w="60" w:type="dxa"/>
+              <w:right w:w="100" w:type="dxa"/>
+            </w:tcMar>
+          </w:tcPr>
+          <w:p>
+            <w:pPr>
+              <w:jc w:val="center"/>
+            </w:pPr>
+            <w:r>
+              <w:t>0.229</w:t>
+            </w:r>
+          </w:p>
+        </w:tc>
+        <w:tc>
+          <w:tcPr>
+            <w:tcW w:w="1300" w:type="dxa"/>
+            <w:tcMar>
+              <w:top w:w="60" w:type="dxa"/>
+              <w:left w:w="100" w:type="dxa"/>
+              <w:bottom w:w="60" w:type="dxa"/>
+              <w:right w:w="100" w:type="dxa"/>
+            </w:tcMar>
+          </w:tcPr>
+          <w:p>
+            <w:pPr>
+              <w:jc w:val="center"/>
+            </w:pPr>
+            <w:r>
+              <w:t>0.208</w:t>
+            </w:r>
+          </w:p>
+        </w:tc>
+        <w:tc>
+          <w:tcPr>
+            <w:tcW w:w="1100" w:type="dxa"/>
+            <w:tcMar>
+              <w:top w:w="60" w:type="dxa"/>
+              <w:left w:w="100" w:type="dxa"/>
+              <w:bottom w:w="60" w:type="dxa"/>
+              <w:right w:w="100" w:type="dxa"/>
+            </w:tcMar>
+          </w:tcPr>
+          <w:p>
+            <w:pPr>
+              <w:jc w:val="center"/>
+            </w:pPr>
+            <w:r>
+              <w:t>0.162</w:t>
+            </w:r>
+          </w:p>
+        </w:tc>
+        <w:tc>
+          <w:tcPr>
+            <w:tcW w:w="1860" w:type="dxa"/>
+            <w:tcMar>
+              <w:top w:w="60" w:type="dxa"/>
+              <w:left w:w="100" w:type="dxa"/>
+              <w:bottom w:w="60" w:type="dxa"/>
+              <w:right w:w="100" w:type="dxa"/>
+            </w:tcMar>
+          </w:tcPr>
+          <w:p>
+            <w:pPr>
+              <w:jc w:val="center"/>
+            </w:pPr>
+            <w:r>
+              <w:t>95.8%</w:t>
+            </w:r>
+          </w:p>
+        </w:tc>
+      </w:tr>
+      <w:tr>
+        <w:tc>
+          <w:tcPr>
+            <w:tcW w:w="700" w:type="dxa"/>
+            <w:tcMar>
+              <w:top w:w="60" w:type="dxa"/>
+              <w:left w:w="100" w:type="dxa"/>
+              <w:bottom w:w="60" w:type="dxa"/>
+              <w:right w:w="100" w:type="dxa"/>
+            </w:tcMar>
+          </w:tcPr>
+          <w:p>
+            <w:r>
+              <w:t>36</w:t>
+            </w:r>
+          </w:p>
+        </w:tc>
+        <w:tc>
+          <w:tcPr>
+            <w:tcW w:w="1500" w:type="dxa"/>
+            <w:tcMar>
+              <w:top w:w="60" w:type="dxa"/>
+              <w:left w:w="100" w:type="dxa"/>
+              <w:bottom w:w="60" w:type="dxa"/>
+              <w:right w:w="100" w:type="dxa"/>
+            </w:tcMar>
+          </w:tcPr>
+          <w:p>
+            <w:pPr>
+              <w:jc w:val="center"/>
+            </w:pPr>
+            <w:r>
+              <w:t>600 / 100</w:t>
+            </w:r>
+          </w:p>
+        </w:tc>
+        <w:tc>
+          <w:tcPr>
+            <w:tcW w:w="900" w:type="dxa"/>
+            <w:tcMar>
+              <w:top w:w="60" w:type="dxa"/>
+              <w:left w:w="100" w:type="dxa"/>
+              <w:bottom w:w="60" w:type="dxa"/>
+              <w:right w:w="100" w:type="dxa"/>
+            </w:tcMar>
+          </w:tcPr>
+          <w:p>
+            <w:pPr>
+              <w:jc w:val="center"/>
+            </w:pPr>
+            <w:r>
+              <w:t>TF-IDF</w:t>
+            </w:r>
+          </w:p>
+        </w:tc>
+        <w:tc>
+          <w:tcPr>
+            <w:tcW w:w="1000" w:type="dxa"/>
+            <w:tcMar>
+              <w:top w:w="60" w:type="dxa"/>
+              <w:left w:w="100" w:type="dxa"/>
+              <w:bottom w:w="60" w:type="dxa"/>
+              <w:right w:w="100" w:type="dxa"/>
+            </w:tcMar>
+          </w:tcPr>
+          <w:p>
+            <w:pPr>
+              <w:jc w:val="center"/>
+            </w:pPr>
+            <w:r>
+              <w:t>0.042</w:t>
+            </w:r>
+          </w:p>
+        </w:tc>
+        <w:tc>
+          <w:tcPr>
+            <w:tcW w:w="1000" w:type="dxa"/>
+            <w:tcMar>
+              <w:top w:w="60" w:type="dxa"/>
+              <w:left w:w="100" w:type="dxa"/>
+              <w:bottom w:w="60" w:type="dxa"/>
+              <w:right w:w="100" w:type="dxa"/>
+            </w:tcMar>
+          </w:tcPr>
+          <w:p>
+            <w:pPr>
+              <w:jc w:val="center"/>
+            </w:pPr>
+            <w:r>
+              <w:t>0.229</w:t>
+            </w:r>
+          </w:p>
+        </w:tc>
+        <w:tc>
+          <w:tcPr>
+            <w:tcW w:w="1300" w:type="dxa"/>
+            <w:tcMar>
+              <w:top w:w="60" w:type="dxa"/>
+              <w:left w:w="100" w:type="dxa"/>
+              <w:bottom w:w="60" w:type="dxa"/>
+              <w:right w:w="100" w:type="dxa"/>
+            </w:tcMar>
+          </w:tcPr>
+          <w:p>
+            <w:pPr>
+              <w:jc w:val="center"/>
+            </w:pPr>
+            <w:r>
+              <w:t>0.271</w:t>
+            </w:r>
+          </w:p>
+        </w:tc>
+        <w:tc>
+          <w:tcPr>
+            <w:tcW w:w="1100" w:type="dxa"/>
+            <w:tcMar>
+              <w:top w:w="60" w:type="dxa"/>
+              <w:left w:w="100" w:type="dxa"/>
+              <w:bottom w:w="60" w:type="dxa"/>
+              <w:right w:w="100" w:type="dxa"/>
+            </w:tcMar>
+          </w:tcPr>
+          <w:p>
+            <w:pPr>
+              <w:jc w:val="center"/>
+            </w:pPr>
+            <w:r>
+              <w:t>0.149</w:t>
+            </w:r>
+          </w:p>
+        </w:tc>
+        <w:tc>
+          <w:tcPr>
+            <w:tcW w:w="1860" w:type="dxa"/>
+            <w:tcMar>
+              <w:top w:w="60" w:type="dxa"/>
+              <w:left w:w="100" w:type="dxa"/>
+              <w:bottom w:w="60" w:type="dxa"/>
+              <w:right w:w="100" w:type="dxa"/>
+            </w:tcMar>
+          </w:tcPr>
+          <w:p>
+            <w:pPr>
+              <w:jc w:val="center"/>
+            </w:pPr>
+            <w:r>
+              <w:t>100%</w:t>
+            </w:r>
+          </w:p>
+        </w:tc>
+      </w:tr>
+      <w:tr>
+        <w:tc>
+          <w:tcPr>
+            <w:tcW w:w="700" w:type="dxa"/>
+            <w:tcMar>
+              <w:top w:w="60" w:type="dxa"/>
+              <w:left w:w="100" w:type="dxa"/>
+              <w:bottom w:w="60" w:type="dxa"/>
+              <w:right w:w="100" w:type="dxa"/>
+            </w:tcMar>
+          </w:tcPr>
+          <w:p>
+            <w:r>
+              <w:t>38</w:t>
+            </w:r>
+          </w:p>
+        </w:tc>
+        <w:tc>
+          <w:tcPr>
+            <w:tcW w:w="1500" w:type="dxa"/>
+            <w:tcMar>
+              <w:top w:w="60" w:type="dxa"/>
+              <w:left w:w="100" w:type="dxa"/>
+              <w:bottom w:w="60" w:type="dxa"/>
+              <w:right w:w="100" w:type="dxa"/>
+            </w:tcMar>
+          </w:tcPr>
+          <w:p>
+            <w:pPr>
+              <w:jc w:val="center"/>
+            </w:pPr>
+            <w:r>
+              <w:t>Page</w:t>
+            </w:r>
+          </w:p>
+        </w:tc>
+        <w:tc>
+          <w:tcPr>
+            <w:tcW w:w="900" w:type="dxa"/>
+            <w:tcMar>
+              <w:top w:w="60" w:type="dxa"/>
+              <w:left w:w="100" w:type="dxa"/>
+              <w:bottom w:w="60" w:type="dxa"/>
+              <w:right w:w="100" w:type="dxa"/>
+            </w:tcMar>
+          </w:tcPr>
+          <w:p>
+            <w:pPr>
+              <w:jc w:val="center"/>
+            </w:pPr>
+            <w:r>
+              <w:t>BM25</w:t>
+            </w:r>
+          </w:p>
+        </w:tc>
+        <w:tc>
+          <w:tcPr>
+            <w:tcW w:w="1000" w:type="dxa"/>
+            <w:tcMar>
+              <w:top w:w="60" w:type="dxa"/>
+              <w:left w:w="100" w:type="dxa"/>
+              <w:bottom w:w="60" w:type="dxa"/>
+              <w:right w:w="100" w:type="dxa"/>
+            </w:tcMar>
+          </w:tcPr>
+          <w:p>
+            <w:pPr>
+              <w:jc w:val="center"/>
+            </w:pPr>
+            <w:r>
+              <w:t>0.229</w:t>
+            </w:r>
+          </w:p>
+        </w:tc>
+        <w:tc>
+          <w:tcPr>
+            <w:tcW w:w="1000" w:type="dxa"/>
+            <w:tcMar>
+              <w:top w:w="60" w:type="dxa"/>
+              <w:left w:w="100" w:type="dxa"/>
+              <w:bottom w:w="60" w:type="dxa"/>
+              <w:right w:w="100" w:type="dxa"/>
+            </w:tcMar>
+          </w:tcPr>
+          <w:p>
+            <w:pPr>
+              <w:jc w:val="center"/>
+            </w:pPr>
+            <w:r>
+              <w:t>0.479</w:t>
+            </w:r>
+          </w:p>
+        </w:tc>
+        <w:tc>
+          <w:tcPr>
+            <w:tcW w:w="1300" w:type="dxa"/>
+            <w:tcMar>
+              <w:top w:w="60" w:type="dxa"/>
+              <w:left w:w="100" w:type="dxa"/>
+              <w:bottom w:w="60" w:type="dxa"/>
+              <w:right w:w="100" w:type="dxa"/>
+            </w:tcMar>
+          </w:tcPr>
+          <w:p>
+            <w:pPr>
+              <w:jc w:val="center"/>
+            </w:pPr>
+            <w:r>
+              <w:t>0.542</w:t>
+            </w:r>
+          </w:p>
+        </w:tc>
+        <w:tc>
+          <w:tcPr>
+            <w:tcW w:w="1100" w:type="dxa"/>
+            <w:tcMar>
+              <w:top w:w="60" w:type="dxa"/>
+              <w:left w:w="100" w:type="dxa"/>
+              <w:bottom w:w="60" w:type="dxa"/>
+              <w:right w:w="100" w:type="dxa"/>
+            </w:tcMar>
+          </w:tcPr>
+          <w:p>
+            <w:pPr>
+              <w:jc w:val="center"/>
+            </w:pPr>
+            <w:r>
+              <w:t>0.322</w:t>
+            </w:r>
+          </w:p>
+        </w:tc>
+        <w:tc>
+          <w:tcPr>
+            <w:tcW w:w="1860" w:type="dxa"/>
+            <w:tcMar>
+              <w:top w:w="60" w:type="dxa"/>
+              <w:left w:w="100" w:type="dxa"/>
+              <w:bottom w:w="60" w:type="dxa"/>
+              <w:right w:w="100" w:type="dxa"/>
+            </w:tcMar>
+          </w:tcPr>
+          <w:p>
+            <w:pPr>
+              <w:jc w:val="center"/>
+            </w:pPr>
+            <w:r>
+              <w:t>100%</w:t>
+            </w:r>
+          </w:p>
+        </w:tc>
+      </w:tr>
+      <w:tr>
+        <w:tc>
+          <w:tcPr>
+            <w:tcW w:w="700" w:type="dxa"/>
+            <w:tcMar>
+              <w:top w:w="60" w:type="dxa"/>
+              <w:left w:w="100" w:type="dxa"/>
+              <w:bottom w:w="60" w:type="dxa"/>
+              <w:right w:w="100" w:type="dxa"/>
+            </w:tcMar>
+          </w:tcPr>
+          <w:p>
+            <w:r>
+              <w:t>40</w:t>
+            </w:r>
+          </w:p>
+        </w:tc>
+        <w:tc>
+          <w:tcPr>
+            <w:tcW w:w="1500" w:type="dxa"/>
+            <w:tcMar>
+              <w:top w:w="60" w:type="dxa"/>
+              <w:left w:w="100" w:type="dxa"/>
+              <w:bottom w:w="60" w:type="dxa"/>
+              <w:right w:w="100" w:type="dxa"/>
+            </w:tcMar>
+          </w:tcPr>
+          <w:p>
+            <w:pPr>
+              <w:jc w:val="center"/>
+            </w:pPr>
+            <w:r>
+              <w:t>300 / 50</w:t>
+            </w:r>
+          </w:p>
+        </w:tc>
+        <w:tc>
+          <w:tcPr>
+            <w:tcW w:w="900" w:type="dxa"/>
+            <w:tcMar>
+              <w:top w:w="60" w:type="dxa"/>
+              <w:left w:w="100" w:type="dxa"/>
+              <w:bottom w:w="60" w:type="dxa"/>
+              <w:right w:w="100" w:type="dxa"/>
+            </w:tcMar>
+          </w:tcPr>
+          <w:p>
+            <w:pPr>
+              <w:jc w:val="center"/>
+            </w:pPr>
+            <w:r>
+              <w:t>BM25</w:t>
+            </w:r>
+          </w:p>
+        </w:tc>
+        <w:tc>
+          <w:tcPr>
+            <w:tcW w:w="1000" w:type="dxa"/>
+            <w:tcMar>
+              <w:top w:w="60" w:type="dxa"/>
+              <w:left w:w="100" w:type="dxa"/>
+              <w:bottom w:w="60" w:type="dxa"/>
+              <w:right w:w="100" w:type="dxa"/>
+            </w:tcMar>
+          </w:tcPr>
+          <w:p>
+            <w:pPr>
+              <w:jc w:val="center"/>
+            </w:pPr>
+            <w:r>
+              <w:t>0.167</w:t>
+            </w:r>
+          </w:p>
+        </w:tc>
+        <w:tc>
+          <w:tcPr>
+            <w:tcW w:w="1000" w:type="dxa"/>
+            <w:tcMar>
+              <w:top w:w="60" w:type="dxa"/>
+              <w:left w:w="100" w:type="dxa"/>
+              <w:bottom w:w="60" w:type="dxa"/>
+              <w:right w:w="100" w:type="dxa"/>
+            </w:tcMar>
+          </w:tcPr>
+          <w:p>
+            <w:pPr>
+              <w:jc w:val="center"/>
+            </w:pPr>
+            <w:r>
+              <w:t>0.438</w:t>
+            </w:r>
+          </w:p>
+        </w:tc>
+        <w:tc>
+          <w:tcPr>
+            <w:tcW w:w="1300" w:type="dxa"/>
+            <w:tcMar>
+              <w:top w:w="60" w:type="dxa"/>
+              <w:left w:w="100" w:type="dxa"/>
+              <w:bottom w:w="60" w:type="dxa"/>
+              <w:right w:w="100" w:type="dxa"/>
+            </w:tcMar>
+          </w:tcPr>
+          <w:p>
+            <w:pPr>
+              <w:jc w:val="center"/>
+            </w:pPr>
+            <w:r>
+              <w:t>0.354</w:t>
+            </w:r>
+          </w:p>
+        </w:tc>
+        <w:tc>
+          <w:tcPr>
+            <w:tcW w:w="1100" w:type="dxa"/>
+            <w:tcMar>
+              <w:top w:w="60" w:type="dxa"/>
+              <w:left w:w="100" w:type="dxa"/>
+              <w:bottom w:w="60" w:type="dxa"/>
+              <w:right w:w="100" w:type="dxa"/>
+            </w:tcMar>
+          </w:tcPr>
+          <w:p>
+            <w:pPr>
+              <w:jc w:val="center"/>
+            </w:pPr>
+            <w:r>
+              <w:t>0.286</w:t>
+            </w:r>
+          </w:p>
+        </w:tc>
+        <w:tc>
+          <w:tcPr>
+            <w:tcW w:w="1860" w:type="dxa"/>
+            <w:tcMar>
+              <w:top w:w="60" w:type="dxa"/>
+              <w:left w:w="100" w:type="dxa"/>
+              <w:bottom w:w="60" w:type="dxa"/>
+              <w:right w:w="100" w:type="dxa"/>
+            </w:tcMar>
+          </w:tcPr>
+          <w:p>
+            <w:pPr>
+              <w:jc w:val="center"/>
+            </w:pPr>
+            <w:r>
+              <w:t>95.8%</w:t>
+            </w:r>
+          </w:p>
+        </w:tc>
+      </w:tr>
+      <w:tr>
+        <w:tc>
+          <w:tcPr>
+            <w:tcW w:w="700" w:type="dxa"/>
+            <w:tcMar>
+              <w:top w:w="60" w:type="dxa"/>
+              <w:left w:w="100" w:type="dxa"/>
+              <w:bottom w:w="60" w:type="dxa"/>
+              <w:right w:w="100" w:type="dxa"/>
+            </w:tcMar>
+          </w:tcPr>
+          <w:p>
+            <w:r>
+              <w:t>42</w:t>
+            </w:r>
+          </w:p>
+        </w:tc>
+        <w:tc>
+          <w:tcPr>
+            <w:tcW w:w="1500" w:type="dxa"/>
+            <w:tcMar>
+              <w:top w:w="60" w:type="dxa"/>
+              <w:left w:w="100" w:type="dxa"/>
+              <w:bottom w:w="60" w:type="dxa"/>
+              <w:right w:w="100" w:type="dxa"/>
+            </w:tcMar>
+          </w:tcPr>
+          <w:p>
+            <w:pPr>
+              <w:jc w:val="center"/>
+            </w:pPr>
+            <w:r>
+              <w:t>600 / 100</w:t>
+            </w:r>
+          </w:p>
+        </w:tc>
+        <w:tc>
+          <w:tcPr>
+            <w:tcW w:w="900" w:type="dxa"/>
+            <w:tcMar>
+              <w:top w:w="60" w:type="dxa"/>
+              <w:left w:w="100" w:type="dxa"/>
+              <w:bottom w:w="60" w:type="dxa"/>
+              <w:right w:w="100" w:type="dxa"/>
+            </w:tcMar>
+          </w:tcPr>
+          <w:p>
+            <w:pPr>
+              <w:jc w:val="center"/>
+            </w:pPr>
+            <w:r>
+              <w:t>BM25</w:t>
+            </w:r>
+          </w:p>
+        </w:tc>
+        <w:tc>
+          <w:tcPr>
+            <w:tcW w:w="1000" w:type="dxa"/>
+            <w:tcMar>
+              <w:top w:w="60" w:type="dxa"/>
+              <w:left w:w="100" w:type="dxa"/>
+              <w:bottom w:w="60" w:type="dxa"/>
+              <w:right w:w="100" w:type="dxa"/>
+            </w:tcMar>
+          </w:tcPr>
+          <w:p>
+            <w:pPr>
+              <w:jc w:val="center"/>
+            </w:pPr>
+            <w:r>
+              <w:t>0.229</w:t>
+            </w:r>
+          </w:p>
+        </w:tc>
+        <w:tc>
+          <w:tcPr>
+            <w:tcW w:w="1000" w:type="dxa"/>
+            <w:tcMar>
+              <w:top w:w="60" w:type="dxa"/>
+              <w:left w:w="100" w:type="dxa"/>
+              <w:bottom w:w="60" w:type="dxa"/>
+              <w:right w:w="100" w:type="dxa"/>
+            </w:tcMar>
+          </w:tcPr>
+          <w:p>
+            <w:pPr>
+              <w:jc w:val="center"/>
+            </w:pPr>
+            <w:r>
+              <w:t>0.479</w:t>
+            </w:r>
+          </w:p>
+        </w:tc>
+        <w:tc>
+          <w:tcPr>
+            <w:tcW w:w="1300" w:type="dxa"/>
+            <w:tcMar>
+              <w:top w:w="60" w:type="dxa"/>
+              <w:left w:w="100" w:type="dxa"/>
+              <w:bottom w:w="60" w:type="dxa"/>
+              <w:right w:w="100" w:type="dxa"/>
+            </w:tcMar>
+          </w:tcPr>
+          <w:p>
+            <w:pPr>
+              <w:jc w:val="center"/>
+            </w:pPr>
+            <w:r>
+              <w:t>0.521</w:t>
+            </w:r>
+          </w:p>
+        </w:tc>
+        <w:tc>
+          <w:tcPr>
+            <w:tcW w:w="1100" w:type="dxa"/>
+            <w:tcMar>
+              <w:top w:w="60" w:type="dxa"/>
+              <w:left w:w="100" w:type="dxa"/>
+              <w:bottom w:w="60" w:type="dxa"/>
+              <w:right w:w="100" w:type="dxa"/>
+            </w:tcMar>
+          </w:tcPr>
+          <w:p>
+            <w:pPr>
+              <w:jc w:val="center"/>
+            </w:pPr>
+            <w:r>
+              <w:t>0.316</w:t>
+            </w:r>
+          </w:p>
+        </w:tc>
+        <w:tc>
+          <w:tcPr>
+            <w:tcW w:w="1860" w:type="dxa"/>
+            <w:tcMar>
+              <w:top w:w="60" w:type="dxa"/>
+              <w:left w:w="100" w:type="dxa"/>
+              <w:bottom w:w="60" w:type="dxa"/>
+              <w:right w:w="100" w:type="dxa"/>
+            </w:tcMar>
+          </w:tcPr>
+          <w:p>
+            <w:pPr>
+              <w:jc w:val="center"/>
+            </w:pPr>
+            <w:r>
+              <w:t>100%</w:t>
+            </w:r>
+          </w:p>
+        </w:tc>
+      </w:tr>
+    </w:tbl>
+    <w:p>
+      <w:pPr>
+        <w:spacing w:after="160"/>
+      </w:pPr>
+    </w:p>
+    <w:p>
+      <w:pPr>
+        <w:spacing w:after="140" w:line="276" w:lineRule="auto"/>
+      </w:pPr>
+      <w:r>
+        <w:rPr>
+          <w:sz w:val="22"/>
+          <w:szCs w:val="22"/>
+        </w:rPr>
+        <w:t>Scores moved by at most two questions, which is inside the noise. Page chunks still tie or lead under both retrievers, so the recommendation stands. BM25 clearly beats TF-IDF, finding the evidence page in the top 5 for about half the questions.</w:t>
       </w:r>
     </w:p>
     <w:sectPr>

</xml_diff>